<commit_message>
Update report for free model with real screenshots; refresh speech script
Co-Authored-By: Claude Opus 5.5 <noreply@anthropic.com>
Claude-Session: https://claude.ai/code/session_012pP8oxEhUH7nyouqvHLwCK
</commit_message>
<xml_diff>
--- a/親密關係/三分鐘演講稿.docx
+++ b/親密關係/三分鐘演講稿.docx
@@ -165,7 +165,7 @@
               <w:jc w:val="left"/>
             </w:pPr>
             <w:r>
-              <w:t xml:space="preserve">四科擠在同一週；三個痛點：答錯不知為何、英文看不懂、不知道先讀哪章；成果：1,441 題、免費試用 48 題、解鎖碼</w:t>
+              <w:t xml:space="preserve">四科擠在同一週；三個痛點：答錯不知為何、英文看不懂、不知道先讀哪章；成果：1,581 題、全部免費、班級學習攻略</w:t>
             </w:r>
           </w:p>
         </w:tc>
@@ -203,7 +203,7 @@
               <w:jc w:val="left"/>
             </w:pPr>
             <w:r>
-              <w:t xml:space="preserve">十輪「我提需求 → AI 實作 → 我決定」；用信封加密保護題庫；請第二個 AI（Codex）審查，抓到真漏洞也有誤判</w:t>
+              <w:t xml:space="preserve">十二輪「我提需求 → AI 實作 → 我決定」；請第二個 AI（Codex）審查；從付費改成免費、做全班共用的學習攻略</w:t>
             </w:r>
           </w:p>
         </w:tc>
@@ -296,7 +296,7 @@
         <w:pStyle w:val="BodyText"/>
       </w:pPr>
       <w:r>
-        <w:t xml:space="preserve">不過我說的不是「問 AI 作業答案」，而是把 AI 當成合作夥伴，跟它一起把想法做成真的東西。這學期我就用 AI，在一天之內做出了一個「銘傳大學財金系大一刷題網站」。</w:t>
+        <w:t xml:space="preserve">不過我說的不是「問 AI 作業答案」，而是把 AI 當成合作夥伴，跟它一起把想法做成真的東西。這學期我就用 AI，在一天之內做出了一個「財金系大一刷題網站」。</w:t>
       </w:r>
     </w:p>
     <w:bookmarkEnd w:id="21"/>
@@ -340,10 +340,20 @@
           <w:bCs/>
           <w:b/>
         </w:rPr>
-        <w:t xml:space="preserve">1,441 題</w:t>
-      </w:r>
-      <w:r>
-        <w:t xml:space="preserve">，還有一個每科 12 題的免費試用版。</w:t>
+        <w:t xml:space="preserve">1,581 題</w:t>
+      </w:r>
+      <w:r>
+        <w:t xml:space="preserve">，而且</w:t>
+      </w:r>
+      <w:r>
+        <w:rPr>
+          <w:bCs/>
+          <w:b/>
+        </w:rPr>
+        <w:t xml:space="preserve">全部免費</w:t>
+      </w:r>
+      <w:r>
+        <w:t xml:space="preserve">，手機打開就能刷。</w:t>
       </w:r>
     </w:p>
     <w:bookmarkEnd w:id="22"/>
@@ -361,7 +371,7 @@
         <w:pStyle w:val="FirstParagraph"/>
       </w:pPr>
       <w:r>
-        <w:t xml:space="preserve">這整個過程，是「我提需求、AI 提案和寫程式、我做決定」，來回了十輪。</w:t>
+        <w:t xml:space="preserve">這整個過程，是「我提需求、AI 提案和寫程式、我做決定」，來回了十二輪。</w:t>
       </w:r>
     </w:p>
     <w:p>
@@ -369,7 +379,7 @@
         <w:pStyle w:val="BodyText"/>
       </w:pPr>
       <w:r>
-        <w:t xml:space="preserve">舉例來說，我希望同學不用登入就能用，但又只有付費的人能看到完整題庫。AI 就提出「信封加密」的方法：題庫鎖在一個保險箱裡，每個買家拿到自己的鑰匙信封，輸入解鎖碼就能打開。</w:t>
+        <w:t xml:space="preserve">舉例來說，我希望同學不用登入就能用，又不想讓老師的題庫直接公開在網路上。AI 就提出「信封加密」的方法：題庫鎖在保險箱裡，每個同學拿到自己的解鎖碼，輸入就能打開。</w:t>
       </w:r>
     </w:p>
     <w:p>
@@ -390,7 +400,7 @@
         <w:t xml:space="preserve"> </w:t>
       </w:r>
       <w:r>
-        <w:t xml:space="preserve">來幫忙檢查。它真的找到一個漏洞：同一個人被停用後再買一次，舊程式會停錯人。但它也有一項判斷錯誤。所以我學到，AI 很快，但最後還是要人來判斷。</w:t>
+        <w:t xml:space="preserve">來幫忙檢查。它真的找到一個漏洞：同一個人被停用後重新加入，舊程式會停錯人。但它也有一項判斷錯誤。所以我學到，AI 很快，但最後還是要人來判斷。</w:t>
       </w:r>
     </w:p>
     <w:p>
@@ -398,17 +408,17 @@
         <w:pStyle w:val="BodyText"/>
       </w:pPr>
       <w:r>
-        <w:t xml:space="preserve">另外，題庫有一部分來自老師，所以我決定</w:t>
+        <w:t xml:space="preserve">其實我一開始有設計付費方案，但後來決定</w:t>
       </w:r>
       <w:r>
         <w:rPr>
           <w:bCs/>
           <w:b/>
         </w:rPr>
-        <w:t xml:space="preserve">先取得老師同意</w:t>
-      </w:r>
-      <w:r>
-        <w:t xml:space="preserve">，才會正式販售。</w:t>
+        <w:t xml:space="preserve">把付費拿掉，讓大家免費用</w:t>
+      </w:r>
+      <w:r>
+        <w:t xml:space="preserve">。因為題庫有一部分來自老師，而且我希望我跟同學是一起準備考試的夥伴，而不是賣家和買家。我還做了一個全班共用的「學習攻略」，大家看到新消息可以直接留言補充，就像在群組裡講一句話一樣。</w:t>
       </w:r>
     </w:p>
     <w:bookmarkEnd w:id="23"/>
@@ -443,7 +453,10 @@
           <w:bCs/>
           <w:b/>
         </w:rPr>
-        <w:t xml:space="preserve">AI 可以幫我做很多事，但決定和責任永遠在我身上。</w:t>
+        <w:t xml:space="preserve">AI 可以幫我做很多事，但決定和責任永遠在我身上</w:t>
+      </w:r>
+      <w:r>
+        <w:t xml:space="preserve">——像是要不要收費，就是我自己的決定。</w:t>
       </w:r>
     </w:p>
     <w:p>
@@ -489,7 +502,7 @@
         <w:pStyle w:val="Compact"/>
       </w:pPr>
       <w:r>
-        <w:t xml:space="preserve">超時的話，先刪掉第 3 頁「老師同意」那段（約 10 秒）。</w:t>
+        <w:t xml:space="preserve">超時的話，先刪掉第 3 頁「學習攻略」那一句（約 10 秒）。</w:t>
       </w:r>
     </w:p>
     <w:p>
@@ -501,7 +514,7 @@
         <w:pStyle w:val="Compact"/>
       </w:pPr>
       <w:r>
-        <w:t xml:space="preserve">1,441、Codex、信封加密，這三個關鍵詞講清楚就好，不用解釋技術細節。</w:t>
+        <w:t xml:space="preserve">1,581 題、免費、Codex、信封加密，這幾個關鍵詞講清楚就好，不用解釋技術細節。</w:t>
       </w:r>
     </w:p>
     <w:bookmarkEnd w:id="26"/>

</xml_diff>

<commit_message>
Refocus report and speech on site features; add personal journey
Co-Authored-By: Claude Opus 5.5 <noreply@anthropic.com>
Claude-Session: https://claude.ai/code/session_012pP8oxEhUH7nyouqvHLwCK
</commit_message>
<xml_diff>
--- a/親密關係/三分鐘演講稿.docx
+++ b/親密關係/三分鐘演講稿.docx
@@ -2,7 +2,7 @@
 <file path=word/document.xml><?xml version="1.0" encoding="utf-8"?>
 <w:document xmlns:w="http://schemas.openxmlformats.org/wordprocessingml/2006/main" xmlns:m="http://schemas.openxmlformats.org/officeDocument/2006/math" xmlns:r="http://schemas.openxmlformats.org/officeDocument/2006/relationships" xmlns:o="urn:schemas-microsoft-com:office:office" xmlns:v="urn:schemas-microsoft-com:vml" xmlns:w10="urn:schemas-microsoft-com:office:word" xmlns:a="http://schemas.openxmlformats.org/drawingml/2006/main" xmlns:pic="http://schemas.openxmlformats.org/drawingml/2006/picture" xmlns:wp="http://schemas.openxmlformats.org/drawingml/2006/wordprocessingDrawing">
   <w:body>
-    <w:bookmarkStart w:id="27" w:name="三分鐘演講稿用生成式-ai-打造大一刷題網站"/>
+    <w:bookmarkStart w:id="28" w:name="三分鐘演講稿用生成式-ai-打造大一刷題網站"/>
     <w:p>
       <w:pPr>
         <w:pStyle w:val="Heading1"/>
@@ -103,7 +103,7 @@
               <w:jc w:val="left"/>
             </w:pPr>
             <w:r>
-              <w:t xml:space="preserve">0:00–0:30</w:t>
+              <w:t xml:space="preserve">0:00–0:20</w:t>
             </w:r>
           </w:p>
         </w:tc>
@@ -127,7 +127,7 @@
               <w:jc w:val="left"/>
             </w:pPr>
             <w:r>
-              <w:t xml:space="preserve">自我介紹；我的興趣是用 AI「做出東西」；一天做出刷題網站</w:t>
+              <w:t xml:space="preserve">自我介紹；我的興趣是用 AI「做出東西」</w:t>
             </w:r>
           </w:p>
         </w:tc>
@@ -141,7 +141,7 @@
               <w:jc w:val="left"/>
             </w:pPr>
             <w:r>
-              <w:t xml:space="preserve">0:30–1:15</w:t>
+              <w:t xml:space="preserve">0:20–0:45</w:t>
             </w:r>
           </w:p>
         </w:tc>
@@ -153,7 +153,7 @@
               <w:jc w:val="left"/>
             </w:pPr>
             <w:r>
-              <w:t xml:space="preserve">第 2 頁：為什麼做</w:t>
+              <w:t xml:space="preserve">第 2 頁：我的心路歷程</w:t>
             </w:r>
           </w:p>
         </w:tc>
@@ -165,7 +165,7 @@
               <w:jc w:val="left"/>
             </w:pPr>
             <w:r>
-              <w:t xml:space="preserve">四科擠在同一週；三個痛點：答錯不知為何、英文看不懂、不知道先讀哪章；成果：1,581 題、全部免費、班級學習攻略</w:t>
+              <w:t xml:space="preserve">剛上大學沒有固定教科書可以刷題；把老師給的題目印出來寫，太累；改用 AI 做成網站</w:t>
             </w:r>
           </w:p>
         </w:tc>
@@ -179,7 +179,7 @@
               <w:jc w:val="left"/>
             </w:pPr>
             <w:r>
-              <w:t xml:space="preserve">1:15–2:15</w:t>
+              <w:t xml:space="preserve">0:45–1:25</w:t>
             </w:r>
           </w:p>
         </w:tc>
@@ -191,7 +191,7 @@
               <w:jc w:val="left"/>
             </w:pPr>
             <w:r>
-              <w:t xml:space="preserve">第 3 頁：我怎麼和 AI 合作</w:t>
+              <w:t xml:space="preserve">第 3 頁：為什麼做</w:t>
             </w:r>
           </w:p>
         </w:tc>
@@ -203,7 +203,7 @@
               <w:jc w:val="left"/>
             </w:pPr>
             <w:r>
-              <w:t xml:space="preserve">十二輪「我提需求 → AI 實作 → 我決定」；請第二個 AI（Codex）審查；從付費改成免費、做全班共用的學習攻略</w:t>
+              <w:t xml:space="preserve">三個痛點：答錯不知為何、英文看不懂、不知道先讀哪章；成果：四科 1,581 題、75 張觀念卡、176 個中英名詞</w:t>
             </w:r>
           </w:p>
         </w:tc>
@@ -217,7 +217,7 @@
               <w:jc w:val="left"/>
             </w:pPr>
             <w:r>
-              <w:t xml:space="preserve">2:15–3:00</w:t>
+              <w:t xml:space="preserve">1:25–2:20</w:t>
             </w:r>
           </w:p>
         </w:tc>
@@ -229,7 +229,45 @@
               <w:jc w:val="left"/>
             </w:pPr>
             <w:r>
-              <w:t xml:space="preserve">第 4 頁：我學到什麼</w:t>
+              <w:t xml:space="preserve">第 4 頁：我怎麼和 AI 合作</w:t>
+            </w:r>
+          </w:p>
+        </w:tc>
+        <w:tc>
+          <w:tcPr/>
+          <w:p>
+            <w:pPr>
+              <w:pStyle w:val="Compact"/>
+              <w:jc w:val="left"/>
+            </w:pPr>
+            <w:r>
+              <w:t xml:space="preserve">「我提需求 → AI 實作 → 我決定」循環；信封加密；請第二個 AI（Codex）審查；手機就能刷</w:t>
+            </w:r>
+          </w:p>
+        </w:tc>
+      </w:tr>
+      <w:tr>
+        <w:tc>
+          <w:tcPr/>
+          <w:p>
+            <w:pPr>
+              <w:pStyle w:val="Compact"/>
+              <w:jc w:val="left"/>
+            </w:pPr>
+            <w:r>
+              <w:t xml:space="preserve">2:20–3:00</w:t>
+            </w:r>
+          </w:p>
+        </w:tc>
+        <w:tc>
+          <w:tcPr/>
+          <w:p>
+            <w:pPr>
+              <w:pStyle w:val="Compact"/>
+              <w:jc w:val="left"/>
+            </w:pPr>
+            <w:r>
+              <w:t xml:space="preserve">第 5 頁：我學到什麼</w:t>
             </w:r>
           </w:p>
         </w:tc>
@@ -255,7 +293,7 @@
       </w:r>
     </w:p>
     <w:bookmarkEnd w:id="20"/>
-    <w:bookmarkStart w:id="25" w:name="二近逐字稿約-800-字語速正常約-3-分鐘"/>
+    <w:bookmarkStart w:id="26" w:name="二近逐字稿約-800-字語速正常約-3-分鐘"/>
     <w:p>
       <w:pPr>
         <w:pStyle w:val="Heading2"/>
@@ -264,13 +302,13 @@
         <w:t xml:space="preserve">二、近逐字稿（約 800 字，語速正常約 3 分鐘）</w:t>
       </w:r>
     </w:p>
-    <w:bookmarkStart w:id="21" w:name="第-1-頁開場約-30-秒"/>
+    <w:bookmarkStart w:id="21" w:name="第-1-頁開場約-20-秒"/>
     <w:p>
       <w:pPr>
         <w:pStyle w:val="Heading3"/>
       </w:pPr>
       <w:r>
-        <w:t xml:space="preserve">【第 1 頁｜開場】約 30 秒</w:t>
+        <w:t xml:space="preserve">【第 1 頁｜開場】約 20 秒</w:t>
       </w:r>
     </w:p>
     <w:p>
@@ -296,17 +334,17 @@
         <w:pStyle w:val="BodyText"/>
       </w:pPr>
       <w:r>
-        <w:t xml:space="preserve">不過我說的不是「問 AI 作業答案」，而是把 AI 當成合作夥伴，跟它一起把想法做成真的東西。這學期我就用 AI，在一天之內做出了一個「財金系大一刷題網站」。</w:t>
+        <w:t xml:space="preserve">不過我說的不是「問 AI 作業答案」，而是把 AI 當成合作夥伴，跟它一起把想法做成真的東西。</w:t>
       </w:r>
     </w:p>
     <w:bookmarkEnd w:id="21"/>
-    <w:bookmarkStart w:id="22" w:name="第-2-頁為什麼做約-45-秒"/>
+    <w:bookmarkStart w:id="22" w:name="第-2-頁我的心路歷程約-25-秒"/>
     <w:p>
       <w:pPr>
         <w:pStyle w:val="Heading3"/>
       </w:pPr>
       <w:r>
-        <w:t xml:space="preserve">【第 2 頁｜為什麼做】約 45 秒</w:t>
+        <w:t xml:space="preserve">【第 2 頁｜我的心路歷程】約 25 秒</w:t>
       </w:r>
     </w:p>
     <w:p>
@@ -314,12 +352,42 @@
         <w:pStyle w:val="FirstParagraph"/>
       </w:pPr>
       <w:r>
-        <w:t xml:space="preserve">為什麼要做這個？因為我們大一期中考，四科常常擠在同一週，而且會計跟英文的題目都是英文。</w:t>
-      </w:r>
-    </w:p>
-    <w:p>
-      <w:pPr>
-        <w:pStyle w:val="BodyText"/>
+        <w:t xml:space="preserve">剛上大學的時候，我發現大學不像高中，</w:t>
+      </w:r>
+      <w:r>
+        <w:rPr>
+          <w:bCs/>
+          <w:b/>
+        </w:rPr>
+        <w:t xml:space="preserve">沒有固定的教科書可以讓我刷題</w:t>
+      </w:r>
+      <w:r>
+        <w:t xml:space="preserve">準備考試。還好很多老師會給要考的題目，所以我一開始是</w:t>
+      </w:r>
+      <w:r>
+        <w:rPr>
+          <w:bCs/>
+          <w:b/>
+        </w:rPr>
+        <w:t xml:space="preserve">把老師的題目一張一張印出來寫</w:t>
+      </w:r>
+      <w:r>
+        <w:t xml:space="preserve">。但這樣真的太累了，所以我想：能不能換個方法？於是我用 AI，把這些題目做成了一個「財金系大一刷題網站」。</w:t>
+      </w:r>
+    </w:p>
+    <w:bookmarkEnd w:id="22"/>
+    <w:bookmarkStart w:id="23" w:name="第-3-頁為什麼做約-40-秒"/>
+    <w:p>
+      <w:pPr>
+        <w:pStyle w:val="Heading3"/>
+      </w:pPr>
+      <w:r>
+        <w:t xml:space="preserve">【第 3 頁｜為什麼做】約 40 秒</w:t>
+      </w:r>
+    </w:p>
+    <w:p>
+      <w:pPr>
+        <w:pStyle w:val="FirstParagraph"/>
       </w:pPr>
       <w:r>
         <w:t xml:space="preserve">我發現一般刷題有三個痛點：第一，答錯只知道正解是 C，不知道為什麼錯；第二，英文題目看不懂，就練不到觀念；第三，時間不夠，不知道該先讀哪一章。</w:t>
@@ -343,27 +411,43 @@
         <w:t xml:space="preserve">1,581 題</w:t>
       </w:r>
       <w:r>
-        <w:t xml:space="preserve">，而且</w:t>
+        <w:t xml:space="preserve">，還有</w:t>
+      </w:r>
+      <w:r>
+        <w:t xml:space="preserve"> </w:t>
       </w:r>
       <w:r>
         <w:rPr>
           <w:bCs/>
           <w:b/>
         </w:rPr>
-        <w:t xml:space="preserve">全部免費</w:t>
-      </w:r>
-      <w:r>
-        <w:t xml:space="preserve">，手機打開就能刷。</w:t>
-      </w:r>
-    </w:p>
-    <w:bookmarkEnd w:id="22"/>
-    <w:bookmarkStart w:id="23" w:name="第-3-頁怎麼和-ai-合作約-60-秒"/>
+        <w:t xml:space="preserve">75 張觀念卡</w:t>
+      </w:r>
+      <w:r>
+        <w:t xml:space="preserve">和</w:t>
+      </w:r>
+      <w:r>
+        <w:t xml:space="preserve"> </w:t>
+      </w:r>
+      <w:r>
+        <w:rPr>
+          <w:bCs/>
+          <w:b/>
+        </w:rPr>
+        <w:t xml:space="preserve">176 個中英對照名詞</w:t>
+      </w:r>
+      <w:r>
+        <w:t xml:space="preserve">。</w:t>
+      </w:r>
+    </w:p>
+    <w:bookmarkEnd w:id="23"/>
+    <w:bookmarkStart w:id="24" w:name="第-4-頁怎麼和-ai-合作約-55-秒"/>
     <w:p>
       <w:pPr>
         <w:pStyle w:val="Heading3"/>
       </w:pPr>
       <w:r>
-        <w:t xml:space="preserve">【第 3 頁｜怎麼和 AI 合作】約 60 秒</w:t>
+        <w:t xml:space="preserve">【第 4 頁｜怎麼和 AI 合作】約 55 秒</w:t>
       </w:r>
     </w:p>
     <w:p>
@@ -371,7 +455,7 @@
         <w:pStyle w:val="FirstParagraph"/>
       </w:pPr>
       <w:r>
-        <w:t xml:space="preserve">這整個過程，是「我提需求、AI 提案和寫程式、我做決定」，來回了十二輪。</w:t>
+        <w:t xml:space="preserve">這整個過程，是「我提需求、AI 提案和寫程式、我做決定」，一輪一輪來回。</w:t>
       </w:r>
     </w:p>
     <w:p>
@@ -408,27 +492,27 @@
         <w:pStyle w:val="BodyText"/>
       </w:pPr>
       <w:r>
-        <w:t xml:space="preserve">其實我一開始有設計付費方案，但後來決定</w:t>
+        <w:t xml:space="preserve">而且整個網站</w:t>
       </w:r>
       <w:r>
         <w:rPr>
           <w:bCs/>
           <w:b/>
         </w:rPr>
-        <w:t xml:space="preserve">把付費拿掉，讓大家免費用</w:t>
-      </w:r>
-      <w:r>
-        <w:t xml:space="preserve">。因為題庫有一部分來自老師，而且我希望我跟同學是一起準備考試的夥伴，而不是賣家和買家。我還做了一個全班共用的「學習攻略」，大家看到新消息可以直接留言補充，就像在群組裡講一句話一樣。</w:t>
-      </w:r>
-    </w:p>
-    <w:bookmarkEnd w:id="23"/>
-    <w:bookmarkStart w:id="24" w:name="第-4-頁我學到什麼約-45-秒"/>
+        <w:t xml:space="preserve">手機就能刷</w:t>
+      </w:r>
+      <w:r>
+        <w:t xml:space="preserve">，以前要印一疊紙，現在下課、通勤拿起手機就能練。</w:t>
+      </w:r>
+    </w:p>
+    <w:bookmarkEnd w:id="24"/>
+    <w:bookmarkStart w:id="25" w:name="第-5-頁我學到什麼約-40-秒"/>
     <w:p>
       <w:pPr>
         <w:pStyle w:val="Heading3"/>
       </w:pPr>
       <w:r>
-        <w:t xml:space="preserve">【第 4 頁｜我學到什麼】約 45 秒</w:t>
+        <w:t xml:space="preserve">【第 5 頁｜我學到什麼】約 40 秒</w:t>
       </w:r>
     </w:p>
     <w:p>
@@ -455,9 +539,6 @@
         </w:rPr>
         <w:t xml:space="preserve">AI 可以幫我做很多事，但決定和責任永遠在我身上</w:t>
       </w:r>
-      <w:r>
-        <w:t xml:space="preserve">——像是要不要收費，就是我自己的決定。</w:t>
-      </w:r>
     </w:p>
     <w:p>
       <w:pPr>
@@ -482,9 +563,9 @@
         </w:pict>
       </w:r>
     </w:p>
-    <w:bookmarkEnd w:id="24"/>
     <w:bookmarkEnd w:id="25"/>
-    <w:bookmarkStart w:id="26" w:name="小提醒"/>
+    <w:bookmarkEnd w:id="26"/>
+    <w:bookmarkStart w:id="27" w:name="小提醒"/>
     <w:p>
       <w:pPr>
         <w:pStyle w:val="Heading2"/>
@@ -502,7 +583,7 @@
         <w:pStyle w:val="Compact"/>
       </w:pPr>
       <w:r>
-        <w:t xml:space="preserve">超時的話，先刪掉第 3 頁「學習攻略」那一句（約 10 秒）。</w:t>
+        <w:t xml:space="preserve">超時的話，先刪掉第 4 頁「Codex 審查」那段（約 15 秒）。</w:t>
       </w:r>
     </w:p>
     <w:p>
@@ -514,11 +595,11 @@
         <w:pStyle w:val="Compact"/>
       </w:pPr>
       <w:r>
-        <w:t xml:space="preserve">1,581 題、免費、Codex、信封加密，這幾個關鍵詞講清楚就好，不用解釋技術細節。</w:t>
-      </w:r>
-    </w:p>
-    <w:bookmarkEnd w:id="26"/>
+        <w:t xml:space="preserve">1,581 題、觀念卡、Codex、信封加密，這幾個關鍵詞講清楚就好，不用解釋技術細節。</w:t>
+      </w:r>
+    </w:p>
     <w:bookmarkEnd w:id="27"/>
+    <w:bookmarkEnd w:id="28"/>
     <w:sectPr/>
   </w:body>
 </w:document>

</xml_diff>

<commit_message>
Add comparison and flash-review screenshots; update speech for 7 slides
Co-Authored-By: Claude Opus 5.5 <noreply@anthropic.com>
Claude-Session: https://claude.ai/code/session_012pP8oxEhUH7nyouqvHLwCK
</commit_message>
<xml_diff>
--- a/親密關係/三分鐘演講稿.docx
+++ b/親密關係/三分鐘演講稿.docx
@@ -2,7 +2,7 @@
 <file path=word/document.xml><?xml version="1.0" encoding="utf-8"?>
 <w:document xmlns:w="http://schemas.openxmlformats.org/wordprocessingml/2006/main" xmlns:m="http://schemas.openxmlformats.org/officeDocument/2006/math" xmlns:r="http://schemas.openxmlformats.org/officeDocument/2006/relationships" xmlns:o="urn:schemas-microsoft-com:office:office" xmlns:v="urn:schemas-microsoft-com:vml" xmlns:w10="urn:schemas-microsoft-com:office:word" xmlns:a="http://schemas.openxmlformats.org/drawingml/2006/main" xmlns:pic="http://schemas.openxmlformats.org/drawingml/2006/picture" xmlns:wp="http://schemas.openxmlformats.org/drawingml/2006/wordprocessingDrawing">
   <w:body>
-    <w:bookmarkStart w:id="28" w:name="三分鐘演講稿用生成式-ai-打造大一刷題網站"/>
+    <w:bookmarkStart w:id="30" w:name="三分鐘演講稿用生成式-ai-打造大一刷題網站"/>
     <w:p>
       <w:pPr>
         <w:pStyle w:val="Heading1"/>
@@ -103,7 +103,7 @@
               <w:jc w:val="left"/>
             </w:pPr>
             <w:r>
-              <w:t xml:space="preserve">0:00–0:20</w:t>
+              <w:t xml:space="preserve">0:00–0:15</w:t>
             </w:r>
           </w:p>
         </w:tc>
@@ -141,7 +141,7 @@
               <w:jc w:val="left"/>
             </w:pPr>
             <w:r>
-              <w:t xml:space="preserve">0:20–0:45</w:t>
+              <w:t xml:space="preserve">0:15–0:40</w:t>
             </w:r>
           </w:p>
         </w:tc>
@@ -165,7 +165,7 @@
               <w:jc w:val="left"/>
             </w:pPr>
             <w:r>
-              <w:t xml:space="preserve">剛上大學沒有固定教科書可以刷題；把老師給的題目印出來寫，太累；改用 AI 做成網站</w:t>
+              <w:t xml:space="preserve">大學沒有固定教科書可刷題；把老師的題目印出來寫，太累；改用 AI 做成網站</w:t>
             </w:r>
           </w:p>
         </w:tc>
@@ -179,7 +179,7 @@
               <w:jc w:val="left"/>
             </w:pPr>
             <w:r>
-              <w:t xml:space="preserve">0:45–1:25</w:t>
+              <w:t xml:space="preserve">0:40–1:05</w:t>
             </w:r>
           </w:p>
         </w:tc>
@@ -203,7 +203,7 @@
               <w:jc w:val="left"/>
             </w:pPr>
             <w:r>
-              <w:t xml:space="preserve">三個痛點：答錯不知為何、英文看不懂、不知道先讀哪章；成果：四科 1,581 題、75 張觀念卡、176 個中英名詞</w:t>
+              <w:t xml:space="preserve">三個痛點：答錯不知為何、英文看不懂、不知道先讀哪章；四科 1,581 題、75 張觀念卡、176 個名詞</w:t>
             </w:r>
           </w:p>
         </w:tc>
@@ -217,31 +217,31 @@
               <w:jc w:val="left"/>
             </w:pPr>
             <w:r>
-              <w:t xml:space="preserve">1:25–2:20</w:t>
-            </w:r>
-          </w:p>
-        </w:tc>
-        <w:tc>
-          <w:tcPr/>
-          <w:p>
-            <w:pPr>
-              <w:pStyle w:val="Compact"/>
-              <w:jc w:val="left"/>
-            </w:pPr>
-            <w:r>
-              <w:t xml:space="preserve">第 4 頁：我怎麼和 AI 合作</w:t>
-            </w:r>
-          </w:p>
-        </w:tc>
-        <w:tc>
-          <w:tcPr/>
-          <w:p>
-            <w:pPr>
-              <w:pStyle w:val="Compact"/>
-              <w:jc w:val="left"/>
-            </w:pPr>
-            <w:r>
-              <w:t xml:space="preserve">「我提需求 → AI 實作 → 我決定」循環；信封加密；請第二個 AI（Codex）審查；手機就能刷</w:t>
+              <w:t xml:space="preserve">1:05–1:35</w:t>
+            </w:r>
+          </w:p>
+        </w:tc>
+        <w:tc>
+          <w:tcPr/>
+          <w:p>
+            <w:pPr>
+              <w:pStyle w:val="Compact"/>
+              <w:jc w:val="left"/>
+            </w:pPr>
+            <w:r>
+              <w:t xml:space="preserve">第 4 頁：老師的題庫 vs 我的網站</w:t>
+            </w:r>
+          </w:p>
+        </w:tc>
+        <w:tc>
+          <w:tcPr/>
+          <w:p>
+            <w:pPr>
+              <w:pStyle w:val="Compact"/>
+              <w:jc w:val="left"/>
+            </w:pPr>
+            <w:r>
+              <w:t xml:space="preserve">老師的測驗只有對錯；我的網站答錯有中文解釋、為什麼錯、原文線索、關鍵單字</w:t>
             </w:r>
           </w:p>
         </w:tc>
@@ -255,31 +255,107 @@
               <w:jc w:val="left"/>
             </w:pPr>
             <w:r>
-              <w:t xml:space="preserve">2:20–3:00</w:t>
-            </w:r>
-          </w:p>
-        </w:tc>
-        <w:tc>
-          <w:tcPr/>
-          <w:p>
-            <w:pPr>
-              <w:pStyle w:val="Compact"/>
-              <w:jc w:val="left"/>
-            </w:pPr>
-            <w:r>
-              <w:t xml:space="preserve">第 5 頁：我學到什麼</w:t>
-            </w:r>
-          </w:p>
-        </w:tc>
-        <w:tc>
-          <w:tcPr/>
-          <w:p>
-            <w:pPr>
-              <w:pStyle w:val="Compact"/>
-              <w:jc w:val="left"/>
-            </w:pPr>
-            <w:r>
-              <w:t xml:space="preserve">需求要靠「用」出來；決策和責任在人身上；和 AI 的關係也是一種當代關係：靠溝通形成、需要界線、會變遷；謝謝大家</w:t>
+              <w:t xml:space="preserve">1:35–2:00</w:t>
+            </w:r>
+          </w:p>
+        </w:tc>
+        <w:tc>
+          <w:tcPr/>
+          <w:p>
+            <w:pPr>
+              <w:pStyle w:val="Compact"/>
+              <w:jc w:val="left"/>
+            </w:pPr>
+            <w:r>
+              <w:t xml:space="preserve">第 5 頁：速記瀏覽模式</w:t>
+            </w:r>
+          </w:p>
+        </w:tc>
+        <w:tc>
+          <w:tcPr/>
+          <w:p>
+            <w:pPr>
+              <w:pStyle w:val="Compact"/>
+              <w:jc w:val="left"/>
+            </w:pPr>
+            <w:r>
+              <w:t xml:space="preserve">考前快速複習：關鍵字標色、原文對照、答案放大、錯誤選項劃掉</w:t>
+            </w:r>
+          </w:p>
+        </w:tc>
+      </w:tr>
+      <w:tr>
+        <w:tc>
+          <w:tcPr/>
+          <w:p>
+            <w:pPr>
+              <w:pStyle w:val="Compact"/>
+              <w:jc w:val="left"/>
+            </w:pPr>
+            <w:r>
+              <w:t xml:space="preserve">2:00–2:30</w:t>
+            </w:r>
+          </w:p>
+        </w:tc>
+        <w:tc>
+          <w:tcPr/>
+          <w:p>
+            <w:pPr>
+              <w:pStyle w:val="Compact"/>
+              <w:jc w:val="left"/>
+            </w:pPr>
+            <w:r>
+              <w:t xml:space="preserve">第 6 頁：我怎麼和 AI 合作</w:t>
+            </w:r>
+          </w:p>
+        </w:tc>
+        <w:tc>
+          <w:tcPr/>
+          <w:p>
+            <w:pPr>
+              <w:pStyle w:val="Compact"/>
+              <w:jc w:val="left"/>
+            </w:pPr>
+            <w:r>
+              <w:t xml:space="preserve">我提需求 → AI 實作 → 我決定；信封加密；Codex 審查</w:t>
+            </w:r>
+          </w:p>
+        </w:tc>
+      </w:tr>
+      <w:tr>
+        <w:tc>
+          <w:tcPr/>
+          <w:p>
+            <w:pPr>
+              <w:pStyle w:val="Compact"/>
+              <w:jc w:val="left"/>
+            </w:pPr>
+            <w:r>
+              <w:t xml:space="preserve">2:30–3:00</w:t>
+            </w:r>
+          </w:p>
+        </w:tc>
+        <w:tc>
+          <w:tcPr/>
+          <w:p>
+            <w:pPr>
+              <w:pStyle w:val="Compact"/>
+              <w:jc w:val="left"/>
+            </w:pPr>
+            <w:r>
+              <w:t xml:space="preserve">第 7 頁：我學到什麼</w:t>
+            </w:r>
+          </w:p>
+        </w:tc>
+        <w:tc>
+          <w:tcPr/>
+          <w:p>
+            <w:pPr>
+              <w:pStyle w:val="Compact"/>
+              <w:jc w:val="left"/>
+            </w:pPr>
+            <w:r>
+              <w:t xml:space="preserve">需求靠「用」出來；決策和責任在人；和 AI 的關係也是當代關係；謝謝大家</w:t>
             </w:r>
           </w:p>
         </w:tc>
@@ -293,22 +369,22 @@
       </w:r>
     </w:p>
     <w:bookmarkEnd w:id="20"/>
-    <w:bookmarkStart w:id="26" w:name="二近逐字稿約-800-字語速正常約-3-分鐘"/>
+    <w:bookmarkStart w:id="28" w:name="二近逐字稿語速正常約-3-分鐘"/>
     <w:p>
       <w:pPr>
         <w:pStyle w:val="Heading2"/>
       </w:pPr>
       <w:r>
-        <w:t xml:space="preserve">二、近逐字稿（約 800 字，語速正常約 3 分鐘）</w:t>
-      </w:r>
-    </w:p>
-    <w:bookmarkStart w:id="21" w:name="第-1-頁開場約-20-秒"/>
+        <w:t xml:space="preserve">二、近逐字稿（語速正常約 3 分鐘）</w:t>
+      </w:r>
+    </w:p>
+    <w:bookmarkStart w:id="21" w:name="第-1-頁開場約-15-秒"/>
     <w:p>
       <w:pPr>
         <w:pStyle w:val="Heading3"/>
       </w:pPr>
       <w:r>
-        <w:t xml:space="preserve">【第 1 頁｜開場】約 20 秒</w:t>
+        <w:t xml:space="preserve">【第 1 頁｜開場】約 15 秒</w:t>
       </w:r>
     </w:p>
     <w:p>
@@ -316,7 +392,7 @@
         <w:pStyle w:val="FirstParagraph"/>
       </w:pPr>
       <w:r>
-        <w:t xml:space="preserve">大家好，我是財金一丙的林言樵。老師說這次期中報告可以介紹自己的興趣，所以今天想跟大家分享我的興趣：</w:t>
+        <w:t xml:space="preserve">大家好，我是財金一丙的林言樵。今天想分享我的興趣：</w:t>
       </w:r>
       <w:r>
         <w:rPr>
@@ -326,15 +402,7 @@
         <w:t xml:space="preserve">使用生成式 AI</w:t>
       </w:r>
       <w:r>
-        <w:t xml:space="preserve">。</w:t>
-      </w:r>
-    </w:p>
-    <w:p>
-      <w:pPr>
-        <w:pStyle w:val="BodyText"/>
-      </w:pPr>
-      <w:r>
-        <w:t xml:space="preserve">不過我說的不是「問 AI 作業答案」，而是把 AI 當成合作夥伴，跟它一起把想法做成真的東西。</w:t>
+        <w:t xml:space="preserve">——不是叫 AI 寫作業，而是跟它一起把想法做成真的東西。</w:t>
       </w:r>
     </w:p>
     <w:bookmarkEnd w:id="21"/>
@@ -352,7 +420,7 @@
         <w:pStyle w:val="FirstParagraph"/>
       </w:pPr>
       <w:r>
-        <w:t xml:space="preserve">剛上大學的時候，我發現大學不像高中，</w:t>
+        <w:t xml:space="preserve">剛上大學，我發現大學</w:t>
       </w:r>
       <w:r>
         <w:rPr>
@@ -362,27 +430,27 @@
         <w:t xml:space="preserve">沒有固定的教科書可以讓我刷題</w:t>
       </w:r>
       <w:r>
-        <w:t xml:space="preserve">準備考試。還好很多老師會給要考的題目，所以我一開始是</w:t>
+        <w:t xml:space="preserve">。還好很多老師會給要考的題目，所以我一開始是</w:t>
       </w:r>
       <w:r>
         <w:rPr>
           <w:bCs/>
           <w:b/>
         </w:rPr>
-        <w:t xml:space="preserve">把老師的題目一張一張印出來寫</w:t>
-      </w:r>
-      <w:r>
-        <w:t xml:space="preserve">。但這樣真的太累了，所以我想：能不能換個方法？於是我用 AI，把這些題目做成了一個「財金系大一刷題網站」。</w:t>
+        <w:t xml:space="preserve">把老師的題目印出來寫</w:t>
+      </w:r>
+      <w:r>
+        <w:t xml:space="preserve">。但這樣真的太累了，所以我決定換個方法：用 AI，把這些題目做成一個「財金系大一刷題網站」。</w:t>
       </w:r>
     </w:p>
     <w:bookmarkEnd w:id="22"/>
-    <w:bookmarkStart w:id="23" w:name="第-3-頁為什麼做約-40-秒"/>
+    <w:bookmarkStart w:id="23" w:name="第-3-頁為什麼做約-25-秒"/>
     <w:p>
       <w:pPr>
         <w:pStyle w:val="Heading3"/>
       </w:pPr>
       <w:r>
-        <w:t xml:space="preserve">【第 3 頁｜為什麼做】約 40 秒</w:t>
+        <w:t xml:space="preserve">【第 3 頁｜為什麼做】約 25 秒</w:t>
       </w:r>
     </w:p>
     <w:p>
@@ -390,15 +458,7 @@
         <w:pStyle w:val="FirstParagraph"/>
       </w:pPr>
       <w:r>
-        <w:t xml:space="preserve">我發現一般刷題有三個痛點：第一，答錯只知道正解是 C，不知道為什麼錯；第二，英文題目看不懂，就練不到觀念；第三，時間不夠，不知道該先讀哪一章。</w:t>
-      </w:r>
-    </w:p>
-    <w:p>
-      <w:pPr>
-        <w:pStyle w:val="BodyText"/>
-      </w:pPr>
-      <w:r>
-        <w:t xml:space="preserve">所以我做的網站，每個選項都有解析、答錯會顯示中文翻譯，還有錯題集告訴你下一步練什麼。最後整理出四科、一共</w:t>
+        <w:t xml:space="preserve">一般刷題有三個痛點：答錯不知道為什麼、英文題目看不懂、不知道先讀哪一章。所以我的網站，每個選項都有解析，英文題有中文翻譯，還有錯題集。現在四科一共</w:t>
       </w:r>
       <w:r>
         <w:t xml:space="preserve"> </w:t>
@@ -434,20 +494,20 @@
           <w:bCs/>
           <w:b/>
         </w:rPr>
-        <w:t xml:space="preserve">176 個中英對照名詞</w:t>
+        <w:t xml:space="preserve">176 個中英名詞</w:t>
       </w:r>
       <w:r>
         <w:t xml:space="preserve">。</w:t>
       </w:r>
     </w:p>
     <w:bookmarkEnd w:id="23"/>
-    <w:bookmarkStart w:id="24" w:name="第-4-頁怎麼和-ai-合作約-55-秒"/>
+    <w:bookmarkStart w:id="24" w:name="第-4-頁老師的題庫-vs-我的網站約-30-秒"/>
     <w:p>
       <w:pPr>
         <w:pStyle w:val="Heading3"/>
       </w:pPr>
       <w:r>
-        <w:t xml:space="preserve">【第 4 頁｜怎麼和 AI 合作】約 55 秒</w:t>
+        <w:t xml:space="preserve">【第 4 頁｜老師的題庫 vs 我的網站】約 30 秒</w:t>
       </w:r>
     </w:p>
     <w:p>
@@ -455,23 +515,83 @@
         <w:pStyle w:val="FirstParagraph"/>
       </w:pPr>
       <w:r>
-        <w:t xml:space="preserve">這整個過程，是「我提需求、AI 提案和寫程式、我做決定」，一輪一輪來回。</w:t>
-      </w:r>
-    </w:p>
-    <w:p>
-      <w:pPr>
-        <w:pStyle w:val="BodyText"/>
-      </w:pPr>
-      <w:r>
-        <w:t xml:space="preserve">舉例來說，我希望同學不用登入就能用，又不想讓老師的題庫直接公開在網路上。AI 就提出「信封加密」的方法：題庫鎖在保險箱裡，每個同學拿到自己的解鎖碼，輸入就能打開。</w:t>
-      </w:r>
-    </w:p>
-    <w:p>
-      <w:pPr>
-        <w:pStyle w:val="BodyText"/>
-      </w:pPr>
-      <w:r>
-        <w:t xml:space="preserve">做完之後，我還請了</w:t>
+        <w:t xml:space="preserve">大家看左邊，這是老師的線上測驗，答完只知道對或錯。右邊是我的網站，答錯的時候，會馬上告訴你</w:t>
+      </w:r>
+      <w:r>
+        <w:rPr>
+          <w:bCs/>
+          <w:b/>
+        </w:rPr>
+        <w:t xml:space="preserve">正確答案、中文解釋、為什麼錯</w:t>
+      </w:r>
+      <w:r>
+        <w:t xml:space="preserve">，還會把</w:t>
+      </w:r>
+      <w:r>
+        <w:rPr>
+          <w:bCs/>
+          <w:b/>
+        </w:rPr>
+        <w:t xml:space="preserve">原文裡的線索</w:t>
+      </w:r>
+      <w:r>
+        <w:t xml:space="preserve">和</w:t>
+      </w:r>
+      <w:r>
+        <w:rPr>
+          <w:bCs/>
+          <w:b/>
+        </w:rPr>
+        <w:t xml:space="preserve">關鍵單字</w:t>
+      </w:r>
+      <w:r>
+        <w:t xml:space="preserve">整理出來。這樣答錯一次就能看懂，下次就不會再錯。</w:t>
+      </w:r>
+    </w:p>
+    <w:bookmarkEnd w:id="24"/>
+    <w:bookmarkStart w:id="25" w:name="第-5-頁速記瀏覽模式約-25-秒"/>
+    <w:p>
+      <w:pPr>
+        <w:pStyle w:val="Heading3"/>
+      </w:pPr>
+      <w:r>
+        <w:t xml:space="preserve">【第 5 頁｜速記瀏覽模式】約 25 秒</w:t>
+      </w:r>
+    </w:p>
+    <w:p>
+      <w:pPr>
+        <w:pStyle w:val="FirstParagraph"/>
+      </w:pPr>
+      <w:r>
+        <w:t xml:space="preserve">考前沒時間一題一題做怎麼辦？我做了一個</w:t>
+      </w:r>
+      <w:r>
+        <w:rPr>
+          <w:bCs/>
+          <w:b/>
+        </w:rPr>
+        <w:t xml:space="preserve">速記瀏覽模式</w:t>
+      </w:r>
+      <w:r>
+        <w:t xml:space="preserve">。題目的關鍵字會用色塊標出來，原文線索直接對照，答案放大、錯的選項直接劃掉。一題一張卡，幾分鐘就能把一整個單元複習完。</w:t>
+      </w:r>
+    </w:p>
+    <w:bookmarkEnd w:id="25"/>
+    <w:bookmarkStart w:id="26" w:name="第-6-頁怎麼和-ai-合作約-30-秒"/>
+    <w:p>
+      <w:pPr>
+        <w:pStyle w:val="Heading3"/>
+      </w:pPr>
+      <w:r>
+        <w:t xml:space="preserve">【第 6 頁｜怎麼和 AI 合作】約 30 秒</w:t>
+      </w:r>
+    </w:p>
+    <w:p>
+      <w:pPr>
+        <w:pStyle w:val="FirstParagraph"/>
+      </w:pPr>
+      <w:r>
+        <w:t xml:space="preserve">這整個網站，是「我提需求、AI 寫程式、我做決定」一輪一輪完成的。像是題庫用「信封加密」保護，輸入解鎖碼才能打開。做完後我還請</w:t>
       </w:r>
       <w:r>
         <w:rPr>
@@ -484,35 +604,17 @@
         <w:t xml:space="preserve"> </w:t>
       </w:r>
       <w:r>
-        <w:t xml:space="preserve">來幫忙檢查。它真的找到一個漏洞：同一個人被停用後重新加入，舊程式會停錯人。但它也有一項判斷錯誤。所以我學到，AI 很快，但最後還是要人來判斷。</w:t>
-      </w:r>
-    </w:p>
-    <w:p>
-      <w:pPr>
-        <w:pStyle w:val="BodyText"/>
-      </w:pPr>
-      <w:r>
-        <w:t xml:space="preserve">而且整個網站</w:t>
-      </w:r>
-      <w:r>
-        <w:rPr>
-          <w:bCs/>
-          <w:b/>
-        </w:rPr>
-        <w:t xml:space="preserve">手機就能刷</w:t>
-      </w:r>
-      <w:r>
-        <w:t xml:space="preserve">，以前要印一疊紙，現在下課、通勤拿起手機就能練。</w:t>
-      </w:r>
-    </w:p>
-    <w:bookmarkEnd w:id="24"/>
-    <w:bookmarkStart w:id="25" w:name="第-5-頁我學到什麼約-40-秒"/>
+        <w:t xml:space="preserve">來檢查，它真的抓到一個漏洞，但也有判斷錯的地方。所以 AI 很快，但最後還是要人來判斷。</w:t>
+      </w:r>
+    </w:p>
+    <w:bookmarkEnd w:id="26"/>
+    <w:bookmarkStart w:id="27" w:name="第-7-頁我學到什麼約-30-秒"/>
     <w:p>
       <w:pPr>
         <w:pStyle w:val="Heading3"/>
       </w:pPr>
       <w:r>
-        <w:t xml:space="preserve">【第 5 頁｜我學到什麼】約 40 秒</w:t>
+        <w:t xml:space="preserve">【第 7 頁｜我學到什麼】約 30 秒</w:t>
       </w:r>
     </w:p>
     <w:p>
@@ -520,7 +622,7 @@
         <w:pStyle w:val="FirstParagraph"/>
       </w:pPr>
       <w:r>
-        <w:t xml:space="preserve">這次我最大的收穫有兩個。第一，</w:t>
+        <w:t xml:space="preserve">我學到兩件事：第一，</w:t>
       </w:r>
       <w:r>
         <w:rPr>
@@ -530,14 +632,17 @@
         <w:t xml:space="preserve">需求是「用」出來的</w:t>
       </w:r>
       <w:r>
-        <w:t xml:space="preserve">——最重要的修正，都是我自己實際操作網站之後才發現的。第二，</w:t>
+        <w:t xml:space="preserve">，最重要的修正，都是我自己實際用過才發現的。第二，</w:t>
       </w:r>
       <w:r>
         <w:rPr>
           <w:bCs/>
           <w:b/>
         </w:rPr>
-        <w:t xml:space="preserve">AI 可以幫我做很多事，但決定和責任永遠在我身上</w:t>
+        <w:t xml:space="preserve">AI 可以幫我做很多事，但決定和責任在我身上</w:t>
+      </w:r>
+      <w:r>
+        <w:t xml:space="preserve">。</w:t>
       </w:r>
     </w:p>
     <w:p>
@@ -545,15 +650,7 @@
         <w:pStyle w:val="BodyText"/>
       </w:pPr>
       <w:r>
-        <w:t xml:space="preserve">最後呼應我們這次的題目「當代親密關係」：我覺得我跟 AI 的關係，其實也很像一段當代的關係——它靠溝通慢慢形成，需要清楚的界線，也會隨著時間改變，從一個工具，變成可以互相提醒的夥伴。</w:t>
-      </w:r>
-    </w:p>
-    <w:p>
-      <w:pPr>
-        <w:pStyle w:val="BodyText"/>
-      </w:pPr>
-      <w:r>
-        <w:t xml:space="preserve">學會跟 AI 相處，我相信會是我們這一代很重要的能力。我的報告到這裡，謝謝大家！</w:t>
+        <w:t xml:space="preserve">最後呼應這次的題目「當代親密關係」：我覺得我跟 AI 的關係，也像一段當代的關係——靠溝通形成、需要界線，也會慢慢改變，從工具變成夥伴。我的報告到這裡，謝謝大家！</w:t>
       </w:r>
     </w:p>
     <w:p>
@@ -563,9 +660,9 @@
         </w:pict>
       </w:r>
     </w:p>
-    <w:bookmarkEnd w:id="25"/>
-    <w:bookmarkEnd w:id="26"/>
-    <w:bookmarkStart w:id="27" w:name="小提醒"/>
+    <w:bookmarkEnd w:id="27"/>
+    <w:bookmarkEnd w:id="28"/>
+    <w:bookmarkStart w:id="29" w:name="小提醒"/>
     <w:p>
       <w:pPr>
         <w:pStyle w:val="Heading2"/>
@@ -583,7 +680,7 @@
         <w:pStyle w:val="Compact"/>
       </w:pPr>
       <w:r>
-        <w:t xml:space="preserve">超時的話，先刪掉第 4 頁「Codex 審查」那段（約 15 秒）。</w:t>
+        <w:t xml:space="preserve">第 4 頁是重點，可以用手指著左右兩張圖比較，講慢一點。</w:t>
       </w:r>
     </w:p>
     <w:p>
@@ -595,11 +692,11 @@
         <w:pStyle w:val="Compact"/>
       </w:pPr>
       <w:r>
-        <w:t xml:space="preserve">1,581 題、觀念卡、Codex、信封加密，這幾個關鍵詞講清楚就好，不用解釋技術細節。</w:t>
-      </w:r>
-    </w:p>
-    <w:bookmarkEnd w:id="27"/>
-    <w:bookmarkEnd w:id="28"/>
+        <w:t xml:space="preserve">超時的話，先刪掉第 6 頁「Codex 審查」那句（約 10 秒）。</w:t>
+      </w:r>
+    </w:p>
+    <w:bookmarkEnd w:id="29"/>
+    <w:bookmarkEnd w:id="30"/>
     <w:sectPr/>
   </w:body>
 </w:document>

</xml_diff>